<commit_message>
Align Mobile syllabus with two graded colloquia
</commit_message>
<xml_diff>
--- a/lendet/2026-2027/mobile/Syllabusi-Programimi-per-Pajisje-Mobile-2026-2027.docx
+++ b/lendet/2026-2027/mobile/Syllabusi-Programimi-per-Pajisje-Mobile-2026-2027.docx
@@ -1920,7 +1920,7 @@
                       <w:color w:val="000000"/>
                       <w:sz w:val="17"/>
                     </w:rPr>
-                    <w:t>MVP-ja: rrjedha kryesore dhe kufijtë e saj</w:t>
+                    <w:t>Kolokviumi I dhe kontrolli i MVP-së</w:t>
                   </w:r>
                 </w:p>
               </w:tc>
@@ -1974,7 +1974,7 @@
                       <w:color w:val="000000"/>
                       <w:sz w:val="17"/>
                     </w:rPr>
-                    <w:t>Plani i javës 7; kontrolli i MVP-së</w:t>
+                    <w:t>Javët 1–6; plani i javës 7</w:t>
                   </w:r>
                 </w:p>
               </w:tc>
@@ -2001,7 +2001,7 @@
                       <w:color w:val="000000"/>
                       <w:sz w:val="17"/>
                     </w:rPr>
-                    <w:t>Demonstrim i kërkesës për vend; reflektim mbi vendimet dhe kontroll formativ.</w:t>
+                    <w:t>Kolokviumi I: 10 pikë. Demonstrim i kërkesës për vend dhe kontroll formativ i MVP-së.</w:t>
                   </w:r>
                 </w:p>
               </w:tc>
@@ -3060,7 +3060,7 @@
                       <w:color w:val="000000"/>
                       <w:sz w:val="17"/>
                     </w:rPr>
-                    <w:t>Testimi, CI/CD dhe publikimi</w:t>
+                    <w:t>Kolokviumi II, testimi dhe CI/CD</w:t>
                   </w:r>
                 </w:p>
               </w:tc>
@@ -3141,7 +3141,7 @@
                       <w:color w:val="000000"/>
                       <w:sz w:val="17"/>
                     </w:rPr>
-                    <w:t>Test i rrjedhës kryesore, kontroll i build-it dhe publikim i versionit.</w:t>
+                    <w:t>Kolokviumi II: 10 pikë; organizimi njoftohet. Test i rrjedhës kryesore dhe publikim i versionit.</w:t>
                   </w:r>
                 </w:p>
               </w:tc>
@@ -3772,7 +3772,18 @@
               <w:rPr>
                 <w:sz w:val="20"/>
               </w:rPr>
-              <w:t>Projekti individual: 40 pikë për një aplikacion Next.js/PWA të përdorshëm nga një biznes real shërbimesh. Demonstrimi dhe mbrojtja: 20 pikë për rrjedhën në telefon, qartësinë e arsyetimit, testet dhe kufijtë e shpjeguar të zgjidhjes.</w:t>
+              <w:t>Projekti individual: 40 pikë për një aplikacion Next.js/PWA të përdorshëm nga një biznes real shërbimesh. Kolokviumi I në javën 7 dhe Kolokviumi II në javën 14 japin nga 10 pikë. Demonstrimi dhe mbrojtja mbeten aktivitete mësimore dhe prova të projektit, pa pikë të veçanta.</w:t>
+            </w:r>
+          </w:p>
+          <w:p>
+            <w:pPr>
+              <w:spacing w:after="60" w:line="252" w:lineRule="auto"/>
+            </w:pPr>
+            <w:r>
+              <w:rPr>
+                <w:sz w:val="20"/>
+              </w:rPr>
+              <w:t>Kolokviumi I: 10 pyetje nga javët 1–6, me 3 alternativa dhe një përgjigje të saktë; e saktë = 1 pikë, e gabuar ose bosh = 0. Profesori hap regjistrimin dhe nis 10 minutat veçmas për G1/G2. Një tentim për student; hyrja e vonuar ka kohën e mbetur. Përgjigjet ruhen; rifreskimi nuk rinis kohën. Rezultatet dalin pas afatit të grupit. Hyrja nuk kërkon GitHub apo vijueshmëri të mëparshme. Kolokviumi II është i planifikuar; organizimi njoftohet para zhvillimit.</w:t>
             </w:r>
           </w:p>
           <w:p>
@@ -4183,7 +4194,7 @@
                       <w:color w:val="000000"/>
                       <w:sz w:val="18"/>
                     </w:rPr>
-                    <w:t>Demo dhe mbrojtja</w:t>
+                    <w:t>Kolokviumi I · Java 7</w:t>
                   </w:r>
                 </w:p>
               </w:tc>
@@ -4210,7 +4221,7 @@
                       <w:color w:val="000000"/>
                       <w:sz w:val="18"/>
                     </w:rPr>
-                    <w:t>20</w:t>
+                    <w:t>10</w:t>
                   </w:r>
                 </w:p>
               </w:tc>
@@ -4237,7 +4248,93 @@
                       <w:color w:val="000000"/>
                       <w:sz w:val="18"/>
                     </w:rPr>
-                    <w:t>Rrjedha në telefon dhe arsyetimi teknik</w:t>
+                    <w:t>10 pyetje nga javët 1–6; 10 minuta</w:t>
+                  </w:r>
+                </w:p>
+              </w:tc>
+            </w:tr>
+            <w:tr>
+              <w:trPr>
+                <w:cantSplit/>
+              </w:trPr>
+              <w:tc>
+                <w:tcPr>
+                  <w:tcW w:type="dxa" w:w="2835"/>
+                  <w:vAlign w:val="center"/>
+                  <w:tcBorders>
+                    <w:top w:val="single" w:sz="4" w:color="909090"/>
+                    <w:left w:val="single" w:sz="4" w:color="909090"/>
+                    <w:bottom w:val="single" w:sz="4" w:color="909090"/>
+                    <w:right w:val="single" w:sz="4" w:color="909090"/>
+                  </w:tcBorders>
+                </w:tcPr>
+                <w:p>
+                  <w:pPr>
+                    <w:spacing w:after="40"/>
+                    <w:jc w:val="left"/>
+                  </w:pPr>
+                  <w:r>
+                    <w:rPr>
+                      <w:b w:val="0"/>
+                      <w:i w:val="0"/>
+                      <w:color w:val="000000"/>
+                      <w:sz w:val="18"/>
+                    </w:rPr>
+                    <w:t>Kolokviumi II · Java 14</w:t>
+                  </w:r>
+                </w:p>
+              </w:tc>
+              <w:tc>
+                <w:tcPr>
+                  <w:tcW w:type="dxa" w:w="1134"/>
+                  <w:vAlign w:val="center"/>
+                  <w:tcBorders>
+                    <w:top w:val="single" w:sz="4" w:color="909090"/>
+                    <w:left w:val="single" w:sz="4" w:color="909090"/>
+                    <w:bottom w:val="single" w:sz="4" w:color="909090"/>
+                    <w:right w:val="single" w:sz="4" w:color="909090"/>
+                  </w:tcBorders>
+                </w:tcPr>
+                <w:p>
+                  <w:pPr>
+                    <w:spacing w:after="40"/>
+                    <w:jc w:val="center"/>
+                  </w:pPr>
+                  <w:r>
+                    <w:rPr>
+                      <w:b w:val="0"/>
+                      <w:i w:val="0"/>
+                      <w:color w:val="000000"/>
+                      <w:sz w:val="18"/>
+                    </w:rPr>
+                    <w:t>10</w:t>
+                  </w:r>
+                </w:p>
+              </w:tc>
+              <w:tc>
+                <w:tcPr>
+                  <w:tcW w:type="dxa" w:w="5669"/>
+                  <w:vAlign w:val="center"/>
+                  <w:tcBorders>
+                    <w:top w:val="single" w:sz="4" w:color="909090"/>
+                    <w:left w:val="single" w:sz="4" w:color="909090"/>
+                    <w:bottom w:val="single" w:sz="4" w:color="909090"/>
+                    <w:right w:val="single" w:sz="4" w:color="909090"/>
+                  </w:tcBorders>
+                </w:tcPr>
+                <w:p>
+                  <w:pPr>
+                    <w:spacing w:after="40"/>
+                    <w:jc w:val="left"/>
+                  </w:pPr>
+                  <w:r>
+                    <w:rPr>
+                      <w:b w:val="0"/>
+                      <w:i w:val="0"/>
+                      <w:color w:val="000000"/>
+                      <w:sz w:val="18"/>
+                    </w:rPr>
+                    <w:t>Organizimi njoftohet para zhvillimit</w:t>
                   </w:r>
                 </w:p>
               </w:tc>
@@ -4311,7 +4408,7 @@
               <w:rPr>
                 <w:sz w:val="20"/>
               </w:rPr>
-              <w:t>Ndarja e fotografisë së QR-së ose regjistrimi për dikë tjetër cenon besueshmërinë e evidencës; rastet trajtohen sipas rregullave të institucionit. Privatësia e studentëve respektohet: historiku i vijueshmërisë është privat, ndërsa pikët individuale komunikohen studentit përkatës dhe stafit të autorizuar.</w:t>
+              <w:t>Ndarja e fotografisë së QR-së ose regjistrimi për dikë tjetër cenon besueshmërinë e evidencës; rastet trajtohen sipas rregullave të institucionit. Historiku i vijueshmërisë është privat. Rezultatet e kolokviumit shfaqin emrin, grupin dhe pikët në sistem, pa email apo indeks. Pikët e tjera individuale komunikohen studentit përkatës dhe stafit të autorizuar.</w:t>
             </w:r>
           </w:p>
           <w:p>

</xml_diff>

<commit_message>
Add group-started mobile colloquium and two-part assessment grading
* Plan group-started mobile colloquium and 70-student rehearsal

* Clarify immutable encrypted bank and ordered answer saves

* Add group colloquium backend and secure enrollment

* Preserve classroom scope on colloquium mutations

* Validate canonical origin through Next internal URL reconstruction

* Add mobile colloquium lobby and assessment UI

* Label colloquium choices by displayed position

* Verify 70 students through a real ten-minute colloquium

* Align Mobile syllabus with two graded colloquia

* Record completed colloquium implementation and rehearsal
</commit_message>
<xml_diff>
--- a/lendet/2026-2027/mobile/Syllabusi-Programimi-per-Pajisje-Mobile-2026-2027.docx
+++ b/lendet/2026-2027/mobile/Syllabusi-Programimi-per-Pajisje-Mobile-2026-2027.docx
@@ -1920,7 +1920,7 @@
                       <w:color w:val="000000"/>
                       <w:sz w:val="17"/>
                     </w:rPr>
-                    <w:t>MVP-ja: rrjedha kryesore dhe kufijtë e saj</w:t>
+                    <w:t>Kolokviumi I dhe kontrolli i MVP-së</w:t>
                   </w:r>
                 </w:p>
               </w:tc>
@@ -1974,7 +1974,7 @@
                       <w:color w:val="000000"/>
                       <w:sz w:val="17"/>
                     </w:rPr>
-                    <w:t>Plani i javës 7; kontrolli i MVP-së</w:t>
+                    <w:t>Javët 1–6; plani i javës 7</w:t>
                   </w:r>
                 </w:p>
               </w:tc>
@@ -2001,7 +2001,7 @@
                       <w:color w:val="000000"/>
                       <w:sz w:val="17"/>
                     </w:rPr>
-                    <w:t>Demonstrim i kërkesës për vend; reflektim mbi vendimet dhe kontroll formativ.</w:t>
+                    <w:t>Kolokviumi I: 10 pikë. Demonstrim i kërkesës për vend dhe kontroll formativ i MVP-së.</w:t>
                   </w:r>
                 </w:p>
               </w:tc>
@@ -3060,7 +3060,7 @@
                       <w:color w:val="000000"/>
                       <w:sz w:val="17"/>
                     </w:rPr>
-                    <w:t>Testimi, CI/CD dhe publikimi</w:t>
+                    <w:t>Kolokviumi II, testimi dhe CI/CD</w:t>
                   </w:r>
                 </w:p>
               </w:tc>
@@ -3141,7 +3141,7 @@
                       <w:color w:val="000000"/>
                       <w:sz w:val="17"/>
                     </w:rPr>
-                    <w:t>Test i rrjedhës kryesore, kontroll i build-it dhe publikim i versionit.</w:t>
+                    <w:t>Kolokviumi II: 10 pikë; organizimi njoftohet. Test i rrjedhës kryesore dhe publikim i versionit.</w:t>
                   </w:r>
                 </w:p>
               </w:tc>
@@ -3772,7 +3772,18 @@
               <w:rPr>
                 <w:sz w:val="20"/>
               </w:rPr>
-              <w:t>Projekti individual: 40 pikë për një aplikacion Next.js/PWA të përdorshëm nga një biznes real shërbimesh. Demonstrimi dhe mbrojtja: 20 pikë për rrjedhën në telefon, qartësinë e arsyetimit, testet dhe kufijtë e shpjeguar të zgjidhjes.</w:t>
+              <w:t>Projekti individual: 40 pikë për një aplikacion Next.js/PWA të përdorshëm nga një biznes real shërbimesh. Kolokviumi I në javën 7 dhe Kolokviumi II në javën 14 japin nga 10 pikë. Demonstrimi dhe mbrojtja mbeten aktivitete mësimore dhe prova të projektit, pa pikë të veçanta.</w:t>
+            </w:r>
+          </w:p>
+          <w:p>
+            <w:pPr>
+              <w:spacing w:after="60" w:line="252" w:lineRule="auto"/>
+            </w:pPr>
+            <w:r>
+              <w:rPr>
+                <w:sz w:val="20"/>
+              </w:rPr>
+              <w:t>Kolokviumi I: 10 pyetje nga javët 1–6, me 3 alternativa dhe një përgjigje të saktë; e saktë = 1 pikë, e gabuar ose bosh = 0. Profesori hap regjistrimin dhe nis 10 minutat veçmas për G1/G2. Një tentim për student; hyrja e vonuar ka kohën e mbetur. Përgjigjet ruhen; rifreskimi nuk rinis kohën. Rezultatet dalin pas afatit të grupit. Hyrja nuk kërkon GitHub apo vijueshmëri të mëparshme. Kolokviumi II është i planifikuar; organizimi njoftohet para zhvillimit.</w:t>
             </w:r>
           </w:p>
           <w:p>
@@ -4183,7 +4194,7 @@
                       <w:color w:val="000000"/>
                       <w:sz w:val="18"/>
                     </w:rPr>
-                    <w:t>Demo dhe mbrojtja</w:t>
+                    <w:t>Kolokviumi I · Java 7</w:t>
                   </w:r>
                 </w:p>
               </w:tc>
@@ -4210,7 +4221,7 @@
                       <w:color w:val="000000"/>
                       <w:sz w:val="18"/>
                     </w:rPr>
-                    <w:t>20</w:t>
+                    <w:t>10</w:t>
                   </w:r>
                 </w:p>
               </w:tc>
@@ -4237,7 +4248,93 @@
                       <w:color w:val="000000"/>
                       <w:sz w:val="18"/>
                     </w:rPr>
-                    <w:t>Rrjedha në telefon dhe arsyetimi teknik</w:t>
+                    <w:t>10 pyetje nga javët 1–6; 10 minuta</w:t>
+                  </w:r>
+                </w:p>
+              </w:tc>
+            </w:tr>
+            <w:tr>
+              <w:trPr>
+                <w:cantSplit/>
+              </w:trPr>
+              <w:tc>
+                <w:tcPr>
+                  <w:tcW w:type="dxa" w:w="2835"/>
+                  <w:vAlign w:val="center"/>
+                  <w:tcBorders>
+                    <w:top w:val="single" w:sz="4" w:color="909090"/>
+                    <w:left w:val="single" w:sz="4" w:color="909090"/>
+                    <w:bottom w:val="single" w:sz="4" w:color="909090"/>
+                    <w:right w:val="single" w:sz="4" w:color="909090"/>
+                  </w:tcBorders>
+                </w:tcPr>
+                <w:p>
+                  <w:pPr>
+                    <w:spacing w:after="40"/>
+                    <w:jc w:val="left"/>
+                  </w:pPr>
+                  <w:r>
+                    <w:rPr>
+                      <w:b w:val="0"/>
+                      <w:i w:val="0"/>
+                      <w:color w:val="000000"/>
+                      <w:sz w:val="18"/>
+                    </w:rPr>
+                    <w:t>Kolokviumi II · Java 14</w:t>
+                  </w:r>
+                </w:p>
+              </w:tc>
+              <w:tc>
+                <w:tcPr>
+                  <w:tcW w:type="dxa" w:w="1134"/>
+                  <w:vAlign w:val="center"/>
+                  <w:tcBorders>
+                    <w:top w:val="single" w:sz="4" w:color="909090"/>
+                    <w:left w:val="single" w:sz="4" w:color="909090"/>
+                    <w:bottom w:val="single" w:sz="4" w:color="909090"/>
+                    <w:right w:val="single" w:sz="4" w:color="909090"/>
+                  </w:tcBorders>
+                </w:tcPr>
+                <w:p>
+                  <w:pPr>
+                    <w:spacing w:after="40"/>
+                    <w:jc w:val="center"/>
+                  </w:pPr>
+                  <w:r>
+                    <w:rPr>
+                      <w:b w:val="0"/>
+                      <w:i w:val="0"/>
+                      <w:color w:val="000000"/>
+                      <w:sz w:val="18"/>
+                    </w:rPr>
+                    <w:t>10</w:t>
+                  </w:r>
+                </w:p>
+              </w:tc>
+              <w:tc>
+                <w:tcPr>
+                  <w:tcW w:type="dxa" w:w="5669"/>
+                  <w:vAlign w:val="center"/>
+                  <w:tcBorders>
+                    <w:top w:val="single" w:sz="4" w:color="909090"/>
+                    <w:left w:val="single" w:sz="4" w:color="909090"/>
+                    <w:bottom w:val="single" w:sz="4" w:color="909090"/>
+                    <w:right w:val="single" w:sz="4" w:color="909090"/>
+                  </w:tcBorders>
+                </w:tcPr>
+                <w:p>
+                  <w:pPr>
+                    <w:spacing w:after="40"/>
+                    <w:jc w:val="left"/>
+                  </w:pPr>
+                  <w:r>
+                    <w:rPr>
+                      <w:b w:val="0"/>
+                      <w:i w:val="0"/>
+                      <w:color w:val="000000"/>
+                      <w:sz w:val="18"/>
+                    </w:rPr>
+                    <w:t>Organizimi njoftohet para zhvillimit</w:t>
                   </w:r>
                 </w:p>
               </w:tc>
@@ -4311,7 +4408,7 @@
               <w:rPr>
                 <w:sz w:val="20"/>
               </w:rPr>
-              <w:t>Ndarja e fotografisë së QR-së ose regjistrimi për dikë tjetër cenon besueshmërinë e evidencës; rastet trajtohen sipas rregullave të institucionit. Privatësia e studentëve respektohet: historiku i vijueshmërisë është privat, ndërsa pikët individuale komunikohen studentit përkatës dhe stafit të autorizuar.</w:t>
+              <w:t>Ndarja e fotografisë së QR-së ose regjistrimi për dikë tjetër cenon besueshmërinë e evidencës; rastet trajtohen sipas rregullave të institucionit. Historiku i vijueshmërisë është privat. Rezultatet e kolokviumit shfaqin emrin, grupin dhe pikët në sistem, pa email apo indeks. Pikët e tjera individuale komunikohen studentit përkatës dhe stafit të autorizuar.</w:t>
             </w:r>
           </w:p>
           <w:p>

</xml_diff>